<commit_message>
Document 03 v1.1 : intégrer ADR-094 (modifications suivies)
Révision du document 03 (Architecture technique) par modifications suivies
à accepter : le repository expérimental est retiré et ses primitives
réimplémentées sans reprise de code ; §6.11 : chaque runtime est écrit comme
adapter du protocole, les starters ne sont pas repris. Fiche de contrôle :
v1.1, septembre 2026. ARB-12, D-9 et R-16 clos.

Co-Authored-By: Claude Opus 5.5 <noreply@anthropic.com>
Claude-Session: https://claude.ai/code/session_01FkGXpMkPiAicNjd6X3E7sz
</commit_message>
<xml_diff>
--- a/docs/03 — Architecture technique — ENISTERE FOUNDATION.docx
+++ b/docs/03 — Architecture technique — ENISTERE FOUNDATION.docx
@@ -196,18 +196,34 @@
           <w:szCs w:val="19"/>
         </w:rPr>
       </w:pPr>
-      <w:r>
-        <w:rPr>
-          <w:rFonts w:ascii="Roboto" w:cs="Roboto" w:eastAsia="Roboto" w:hAnsi="Roboto"/>
-          <w:i w:val="1"/>
-          <w:iCs w:val="1"/>
-          <w:color w:val="596675"/>
-          <w:sz w:val="19"/>
-          <w:szCs w:val="19"/>
-          <w:rtl w:val="0"/>
-        </w:rPr>
-        <w:t xml:space="preserve">Version 1.0 — Dossier projet final — Août 2026</w:t>
-      </w:r>
+      <w:del w:id="9001" w:author="Claude" w:date="2026-09-25T00:00:00Z">
+        <w:r>
+          <w:rPr>
+            <w:rFonts w:ascii="Roboto" w:cs="Roboto" w:eastAsia="Roboto" w:hAnsi="Roboto"/>
+            <w:i w:val="1"/>
+            <w:iCs w:val="1"/>
+            <w:color w:val="596675"/>
+            <w:sz w:val="19"/>
+            <w:szCs w:val="19"/>
+            <w:rtl w:val="0"/>
+          </w:rPr>
+          <w:delText xml:space="preserve">Version 1.0 — Dossier projet final — Août 2026</w:delText>
+        </w:r>
+      </w:del>
+      <w:ins w:id="9002" w:author="Claude" w:date="2026-09-25T00:00:00Z">
+        <w:r>
+          <w:rPr>
+            <w:rFonts w:ascii="Roboto" w:cs="Roboto" w:eastAsia="Roboto" w:hAnsi="Roboto"/>
+            <w:i w:val="1"/>
+            <w:iCs w:val="1"/>
+            <w:color w:val="596675"/>
+            <w:sz w:val="19"/>
+            <w:szCs w:val="19"/>
+            <w:rtl w:val="0"/>
+          </w:rPr>
+          <w:t xml:space="preserve">Version 1.1 — Dossier projet final — Septembre 2026</w:t>
+        </w:r>
+      </w:ins>
     </w:p>
     <w:p>
       <w:pPr>
@@ -627,13 +643,24 @@
                 <w:szCs w:val="18"/>
               </w:rPr>
             </w:pPr>
-            <w:r>
-              <w:rPr>
-                <w:rFonts w:ascii="Roboto" w:hAnsi="Roboto" w:eastAsia="Roboto"/>
-                <w:sz w:val="17"/>
-              </w:rPr>
-              <w:t>1.0</w:t>
-            </w:r>
+            <w:del w:id="9019" w:author="Claude" w:date="2026-09-25T00:00:00Z">
+              <w:r>
+                <w:rPr>
+                  <w:rFonts w:ascii="Roboto" w:hAnsi="Roboto" w:eastAsia="Roboto"/>
+                  <w:sz w:val="17"/>
+                </w:rPr>
+                <w:delText xml:space="preserve">1.0</w:delText>
+              </w:r>
+            </w:del>
+            <w:ins w:id="9020" w:author="Claude" w:date="2026-09-25T00:00:00Z">
+              <w:r>
+                <w:rPr>
+                  <w:rFonts w:ascii="Roboto" w:hAnsi="Roboto" w:eastAsia="Roboto"/>
+                  <w:sz w:val="17"/>
+                </w:rPr>
+                <w:t xml:space="preserve">1.1</w:t>
+              </w:r>
+            </w:ins>
           </w:p>
         </w:tc>
       </w:tr>
@@ -728,13 +755,24 @@
                 <w:szCs w:val="18"/>
               </w:rPr>
             </w:pPr>
-            <w:r>
-              <w:rPr>
-                <w:rFonts w:ascii="Roboto" w:hAnsi="Roboto" w:eastAsia="Roboto"/>
-                <w:sz w:val="17"/>
-              </w:rPr>
-              <w:t>Août 2026</w:t>
-            </w:r>
+            <w:del w:id="9021" w:author="Claude" w:date="2026-09-25T00:00:00Z">
+              <w:r>
+                <w:rPr>
+                  <w:rFonts w:ascii="Roboto" w:hAnsi="Roboto" w:eastAsia="Roboto"/>
+                  <w:sz w:val="17"/>
+                </w:rPr>
+                <w:delText xml:space="preserve">Août 2026</w:delText>
+              </w:r>
+            </w:del>
+            <w:ins w:id="9022" w:author="Claude" w:date="2026-09-25T00:00:00Z">
+              <w:r>
+                <w:rPr>
+                  <w:rFonts w:ascii="Roboto" w:hAnsi="Roboto" w:eastAsia="Roboto"/>
+                  <w:sz w:val="17"/>
+                </w:rPr>
+                <w:t xml:space="preserve">Septembre 2026</w:t>
+              </w:r>
+            </w:ins>
           </w:p>
         </w:tc>
       </w:tr>
@@ -829,13 +867,24 @@
                 <w:szCs w:val="18"/>
               </w:rPr>
             </w:pPr>
-            <w:r>
-              <w:rPr>
-                <w:rFonts w:ascii="Roboto" w:hAnsi="Roboto" w:eastAsia="Roboto"/>
-                <w:sz w:val="17"/>
-              </w:rPr>
-              <w:t>BASELINE V1.0</w:t>
-            </w:r>
+            <w:del w:id="9023" w:author="Claude" w:date="2026-09-25T00:00:00Z">
+              <w:r>
+                <w:rPr>
+                  <w:rFonts w:ascii="Roboto" w:hAnsi="Roboto" w:eastAsia="Roboto"/>
+                  <w:sz w:val="17"/>
+                </w:rPr>
+                <w:delText xml:space="preserve">BASELINE V1.0</w:delText>
+              </w:r>
+            </w:del>
+            <w:ins w:id="9024" w:author="Claude" w:date="2026-09-25T00:00:00Z">
+              <w:r>
+                <w:rPr>
+                  <w:rFonts w:ascii="Roboto" w:hAnsi="Roboto" w:eastAsia="Roboto"/>
+                  <w:sz w:val="17"/>
+                </w:rPr>
+                <w:t xml:space="preserve">BASELINE V1.1 (révision : ADR-094)</w:t>
+              </w:r>
+            </w:ins>
           </w:p>
         </w:tc>
       </w:tr>
@@ -1431,7 +1480,29 @@
         <w:rPr>
           <w:rFonts w:ascii="Roboto" w:hAnsi="Roboto" w:eastAsia="Roboto"/>
         </w:rPr>
-        <w:t>L’implémentation de référence du Kernel, du Engine et du Control Plane utilise TypeScript sur Node.js LTS. Ce choix capitalise sur les actifs déjà démontrés dans le repository expérimental, maximise la réutilisation des modèles et tests existants, réduit la duplication entre CLI, API, compiler et SDK, et maintient une vitesse d’évolution élevée. La frontière d’extension est toutefois indépendante du langage: des adapters, checkers et workers peuvent être développés en Java, Go, Rust, Python ou tout runtime pertinent dès lors qu’ils respectent les contrats versionnés et les permissions déclarées.</w:t>
+        <w:t xml:space="preserve">L’implémentation de référence du Kernel, du Engine et du Control Plane utilise TypeScript sur Node.js LTS. </w:t>
+      </w:r>
+      <w:del w:id="9003" w:author="Claude" w:date="2026-09-25T00:00:00Z">
+        <w:r>
+          <w:rPr>
+            <w:rFonts w:ascii="Roboto" w:hAnsi="Roboto" w:eastAsia="Roboto"/>
+          </w:rPr>
+          <w:delText xml:space="preserve">Ce choix capitalise sur les actifs déjà démontrés dans le repository expérimental, maximise la réutilisation des modèles et tests existants, réduit la duplication</w:delText>
+        </w:r>
+      </w:del>
+      <w:ins w:id="9004" w:author="Claude" w:date="2026-09-25T00:00:00Z">
+        <w:r>
+          <w:rPr>
+            <w:rFonts w:ascii="Roboto" w:hAnsi="Roboto" w:eastAsia="Roboto"/>
+          </w:rPr>
+          <w:t xml:space="preserve">Ce choix prolonge les enseignements du repository expérimental (retiré, ADR-094), réduit la duplication</w:t>
+        </w:r>
+      </w:ins>
+      <w:r>
+        <w:rPr>
+          <w:rFonts w:ascii="Roboto" w:hAnsi="Roboto" w:eastAsia="Roboto"/>
+        </w:rPr>
+        <w:t xml:space="preserve"> entre CLI, API, compiler et SDK, et maintient une vitesse d’évolution élevée. La frontière d’extension est toutefois indépendante du langage: des adapters, checkers et workers peuvent être développés en Java, Go, Rust, Python ou tout runtime pertinent dès lors qu’ils respectent les contrats versionnés et les permissions déclarées.</w:t>
       </w:r>
     </w:p>
     <w:p>
@@ -2733,8 +2804,24 @@
         <w:rPr>
           <w:rFonts w:ascii="Roboto" w:hAnsi="Roboto" w:eastAsia="Roboto"/>
         </w:rPr>
-        <w:t>Le repository expérimental a validé plusieurs primitives difficiles: pipeline de normalisation/résolution/plan, modèles immuables et digests, Runtime Contracts, Platform Baseline, Platform Capability Manifests, conformance, parité comportementale, ownership-aware regeneration et goldens multi-runtime. Ces actifs sont conservés comme preuves et réutilisés lorsque leur responsabilité reste compatible avec la cible.</w:t>
-      </w:r>
+        <w:t xml:space="preserve">Le repository expérimental a validé plusieurs primitives difficiles: pipeline de normalisation/résolution/plan, modèles immuables et digests, Runtime Contracts, Platform Baseline, Platform Capability Manifests, conformance, parité comportementale, ownership-aware regeneration et goldens multi-runtime. </w:t>
+      </w:r>
+      <w:del w:id="9005" w:author="Claude" w:date="2026-09-25T00:00:00Z">
+        <w:r>
+          <w:rPr>
+            <w:rFonts w:ascii="Roboto" w:hAnsi="Roboto" w:eastAsia="Roboto"/>
+          </w:rPr>
+          <w:delText xml:space="preserve">Ces actifs sont conservés comme preuves et réutilisés lorsque leur responsabilité reste compatible avec la cible.</w:delText>
+        </w:r>
+      </w:del>
+      <w:ins w:id="9006" w:author="Claude" w:date="2026-09-25T00:00:00Z">
+        <w:r>
+          <w:rPr>
+            <w:rFonts w:ascii="Roboto" w:hAnsi="Roboto" w:eastAsia="Roboto"/>
+          </w:rPr>
+          <w:t xml:space="preserve">N’ayant jamais été mis en production ni utilisé, ce repository a été retiré (ADR-094) : ces primitives sont réimplémentées dans le nouveau Kernel à partir de leurs enseignements, une seule fois par concept, sans reprise de code.</w:t>
+        </w:r>
+      </w:ins>
     </w:p>
     <w:p>
       <w:pPr>
@@ -5295,7 +5382,29 @@
         <w:rPr>
           <w:rFonts w:ascii="Roboto" w:hAnsi="Roboto" w:eastAsia="Roboto"/>
         </w:rPr>
-        <w:t>Justification: le laboratoire a déjà démontré les primitives déterministes dans cet écosystème; la réutilisation réduit le risque de réécriture, facilite le partage de types entre Kernel, CLI, SDK et services, et conserve une excellente portabilité. Le langage n’est pas imposé aux extensions grâce au protocole externe.</w:t>
+        <w:t xml:space="preserve">Justification: </w:t>
+      </w:r>
+      <w:del w:id="9007" w:author="Claude" w:date="2026-09-25T00:00:00Z">
+        <w:r>
+          <w:rPr>
+            <w:rFonts w:ascii="Roboto" w:hAnsi="Roboto" w:eastAsia="Roboto"/>
+          </w:rPr>
+          <w:delText xml:space="preserve">le laboratoire a déjà démontré les primitives déterministes dans cet écosystème; la réutilisation réduit le risque de réécriture, facilite</w:delText>
+        </w:r>
+      </w:del>
+      <w:ins w:id="9008" w:author="Claude" w:date="2026-09-25T00:00:00Z">
+        <w:r>
+          <w:rPr>
+            <w:rFonts w:ascii="Roboto" w:hAnsi="Roboto" w:eastAsia="Roboto"/>
+          </w:rPr>
+          <w:t xml:space="preserve">le laboratoire a démontré la faisabilité des primitives déterministes dans cet écosystème; ce choix facilite</w:t>
+        </w:r>
+      </w:ins>
+      <w:r>
+        <w:rPr>
+          <w:rFonts w:ascii="Roboto" w:hAnsi="Roboto" w:eastAsia="Roboto"/>
+        </w:rPr>
+        <w:t xml:space="preserve"> le partage de types entre Kernel, CLI, SDK et services, et conserve une excellente portabilité. Le langage n’est pas imposé aux extensions grâce au protocole externe.</w:t>
       </w:r>
     </w:p>
     <w:p>
@@ -11669,7 +11778,32 @@
           <w:rFonts w:ascii="Roboto" w:cs="Nova Mono" w:eastAsia="Roboto" w:hAnsi="Roboto"/>
           <w:rtl w:val="0"/>
         </w:rPr>
-        <w:t xml:space="preserve">Un Runtime Adapter expose les phases DESCRIBE → VALIDATE INTENT → RESOLVE → PLAN → MATERIALIZE/TRANSFORM → VERIFY → OBSERVE → MIGRATE. Les starters historiques deviennent des reference extensions de ce protocole. Le Kernel ne contient aucune condition spécifique à NestJS, Spring, Next.js, Angular, React Native, Flutter ou FastAPI.</w:t>
+        <w:t xml:space="preserve">Un Runtime Adapter expose les phases DESCRIBE → VALIDATE INTENT → RESOLVE → PLAN → MATERIALIZE/TRANSFORM → VERIFY → OBSERVE → MIGRATE. </w:t>
+      </w:r>
+      <w:del w:id="9009" w:author="Claude" w:date="2026-09-25T00:00:00Z">
+        <w:r>
+          <w:rPr>
+            <w:rFonts w:ascii="Roboto" w:cs="Nova Mono" w:eastAsia="Roboto" w:hAnsi="Roboto"/>
+            <w:rtl w:val="0"/>
+          </w:rPr>
+          <w:delText xml:space="preserve">Les starters historiques deviennent des reference extensions de ce protocole.</w:delText>
+        </w:r>
+      </w:del>
+      <w:ins w:id="9010" w:author="Claude" w:date="2026-09-25T00:00:00Z">
+        <w:r>
+          <w:rPr>
+            <w:rFonts w:ascii="Roboto" w:cs="Nova Mono" w:eastAsia="Roboto" w:hAnsi="Roboto"/>
+            <w:rtl w:val="0"/>
+          </w:rPr>
+          <w:t xml:space="preserve">Chaque runtime est écrit comme adapter de ce protocole ; les starters du laboratoire, retirés (ADR-094), ne sont pas repris.</w:t>
+        </w:r>
+      </w:ins>
+      <w:r>
+        <w:rPr>
+          <w:rFonts w:ascii="Roboto" w:cs="Nova Mono" w:eastAsia="Roboto" w:hAnsi="Roboto"/>
+          <w:rtl w:val="0"/>
+        </w:rPr>
+        <w:t xml:space="preserve"> Le Kernel ne contient aucune condition spécifique à NestJS, Spring, Next.js, Angular, React Native, Flutter ou FastAPI.</w:t>
       </w:r>
     </w:p>
     <w:p>
@@ -12511,13 +12645,24 @@
                 <w:szCs w:val="16.4"/>
               </w:rPr>
             </w:pPr>
-            <w:r>
-              <w:rPr>
-                <w:rFonts w:ascii="Roboto" w:hAnsi="Roboto" w:eastAsia="Roboto"/>
-                <w:sz w:val="17"/>
-              </w:rPr>
-              <w:t>Réutilise les actifs prouvés ; types communs ; CLI portable</w:t>
-            </w:r>
+            <w:del w:id="9011" w:author="Claude" w:date="2026-09-25T00:00:00Z">
+              <w:r>
+                <w:rPr>
+                  <w:rFonts w:ascii="Roboto" w:hAnsi="Roboto" w:eastAsia="Roboto"/>
+                  <w:sz w:val="17"/>
+                </w:rPr>
+                <w:delText xml:space="preserve">Réutilise les actifs prouvés ; types communs ; CLI portable</w:delText>
+              </w:r>
+            </w:del>
+            <w:ins w:id="9012" w:author="Claude" w:date="2026-09-25T00:00:00Z">
+              <w:r>
+                <w:rPr>
+                  <w:rFonts w:ascii="Roboto" w:hAnsi="Roboto" w:eastAsia="Roboto"/>
+                  <w:sz w:val="17"/>
+                </w:rPr>
+                <w:t xml:space="preserve">Types communs ; CLI portable ; faisabilité démontrée par le laboratoire</w:t>
+              </w:r>
+            </w:ins>
           </w:p>
         </w:tc>
         <w:tc>
@@ -18436,12 +18581,30 @@
           <w:rFonts w:ascii="Roboto" w:cs="Roboto" w:eastAsia="Roboto" w:hAnsi="Roboto"/>
         </w:rPr>
       </w:pPr>
-      <w:r>
-        <w:rPr>
-          <w:rFonts w:ascii="Roboto" w:cs="Roboto" w:eastAsia="Roboto" w:hAnsi="Roboto"/>
-          <w:rtl w:val="0"/>
-        </w:rPr>
-        <w:t xml:space="preserve">TypeScript/Node.js permet de réutiliser les actifs du laboratoire, mais les interfaces entre Kernel, Engine, workers et extensions sont versionnées pour empêcher le couplage accidentel à une implémentation particulière.</w:t>
+      <w:del w:id="9013" w:author="Claude" w:date="2026-09-25T00:00:00Z">
+        <w:r>
+          <w:rPr>
+            <w:rFonts w:ascii="Roboto" w:cs="Roboto" w:eastAsia="Roboto" w:hAnsi="Roboto"/>
+            <w:rtl w:val="0"/>
+          </w:rPr>
+          <w:delText xml:space="preserve">TypeScript/Node.js permet de réutiliser les actifs du laboratoire, mais les interfaces</w:delText>
+        </w:r>
+      </w:del>
+      <w:ins w:id="9014" w:author="Claude" w:date="2026-09-25T00:00:00Z">
+        <w:r>
+          <w:rPr>
+            <w:rFonts w:ascii="Roboto" w:cs="Roboto" w:eastAsia="Roboto" w:hAnsi="Roboto"/>
+            <w:rtl w:val="0"/>
+          </w:rPr>
+          <w:t xml:space="preserve">TypeScript/Node.js prolonge les enseignements du laboratoire (retiré, ADR-094), et les interfaces</w:t>
+        </w:r>
+      </w:ins>
+      <w:r>
+        <w:rPr>
+          <w:rFonts w:ascii="Roboto" w:cs="Roboto" w:eastAsia="Roboto" w:hAnsi="Roboto"/>
+          <w:rtl w:val="0"/>
+        </w:rPr>
+        <w:t xml:space="preserve"> entre Kernel, Engine, workers et extensions sont versionnées pour empêcher le couplage accidentel à une implémentation particulière.</w:t>
       </w:r>
     </w:p>
     <w:p>
@@ -18802,8 +18965,26 @@
           <w:rFonts w:ascii="Roboto" w:cs="Roboto" w:eastAsia="Roboto" w:hAnsi="Roboto"/>
           <w:rtl w:val="0"/>
         </w:rPr>
-        <w:t xml:space="preserve">Les concepts à généraliser ou remplacer sont Blueprint comme contrat utilisateur total, CSM comme modèle omniscient, catalogues runtime codés en dur, domain.entities, designSystem boolean, regeneration comme lifecycle complet et factory/ comme container de toute la plateforme. La migration technique doit donc extraire les primitives robustes derrière de nouveaux contracts sans réorganiser le repository uniquement pour obtenir une nouvelle arborescence.</w:t>
-      </w:r>
+        <w:t xml:space="preserve">Les concepts à généraliser ou remplacer sont Blueprint comme contrat utilisateur total, CSM comme modèle omniscient, catalogues runtime codés en dur, domain.entities, designSystem boolean, regeneration comme lifecycle complet et factory/ comme container de toute la plateforme. </w:t>
+      </w:r>
+      <w:del w:id="9015" w:author="Claude" w:date="2026-09-25T00:00:00Z">
+        <w:r>
+          <w:rPr>
+            <w:rFonts w:ascii="Roboto" w:cs="Roboto" w:eastAsia="Roboto" w:hAnsi="Roboto"/>
+            <w:rtl w:val="0"/>
+          </w:rPr>
+          <w:delText xml:space="preserve">La migration technique doit donc extraire les primitives robustes derrière de nouveaux contracts sans réorganiser le repository uniquement pour obtenir une nouvelle arborescence.</w:delText>
+        </w:r>
+      </w:del>
+      <w:ins w:id="9016" w:author="Claude" w:date="2026-09-25T00:00:00Z">
+        <w:r>
+          <w:rPr>
+            <w:rFonts w:ascii="Roboto" w:cs="Roboto" w:eastAsia="Roboto" w:hAnsi="Roboto"/>
+            <w:rtl w:val="0"/>
+          </w:rPr>
+          <w:t xml:space="preserve">Le laboratoire ayant été retiré (ADR-094), ces concepts ne sont pas migrés : les primitives robustes sont réimplémentées derrière les nouveaux contracts.</w:t>
+        </w:r>
+      </w:ins>
     </w:p>
     <w:p>
       <w:pPr>
@@ -18936,7 +19117,29 @@
         <w:rPr>
           <w:rFonts w:ascii="Roboto" w:hAnsi="Roboto" w:eastAsia="Roboto"/>
         </w:rPr>
-        <w:t>Cette architecture constitue désormais la référence technique BASELINE V1.0 d’ENISTERE FOUNDATION. Elle doit être lue avec le Cahier des charges produit 02 pour les comportements attendus, la Roadmap 05 pour l’ordre de réalisation, la Carte produit et capacités 08 pour la responsabilité des capacités et le registre 10 pour les risques et hypothèses résiduelles. Les ADR d’implémentation devront rester compatibles avec ces invariants sans rouvrir silencieusement le périmètre fonctionnel.</w:t>
+        <w:t xml:space="preserve">Cette architecture </w:t>
+      </w:r>
+      <w:del w:id="9017" w:author="Claude" w:date="2026-09-25T00:00:00Z">
+        <w:r>
+          <w:rPr>
+            <w:rFonts w:ascii="Roboto" w:hAnsi="Roboto" w:eastAsia="Roboto"/>
+          </w:rPr>
+          <w:delText xml:space="preserve">constitue désormais la référence technique BASELINE V1.0</w:delText>
+        </w:r>
+      </w:del>
+      <w:ins w:id="9018" w:author="Claude" w:date="2026-09-25T00:00:00Z">
+        <w:r>
+          <w:rPr>
+            <w:rFonts w:ascii="Roboto" w:hAnsi="Roboto" w:eastAsia="Roboto"/>
+          </w:rPr>
+          <w:t xml:space="preserve">constitue désormais la référence technique BASELINE V1.1</w:t>
+        </w:r>
+      </w:ins>
+      <w:r>
+        <w:rPr>
+          <w:rFonts w:ascii="Roboto" w:hAnsi="Roboto" w:eastAsia="Roboto"/>
+        </w:rPr>
+        <w:t xml:space="preserve"> d’ENISTERE FOUNDATION. Elle doit être lue avec le Cahier des charges produit 02 pour les comportements attendus, la Roadmap 05 pour l’ordre de réalisation, la Carte produit et capacités 08 pour la responsabilité des capacités et le registre 10 pour les risques et hypothèses résiduelles. Les ADR d’implémentation devront rester compatibles avec ces invariants sans rouvrir silencieusement le périmètre fonctionnel.</w:t>
       </w:r>
     </w:p>
     <w:p>

</xml_diff>